<commit_message>
Add GitHub screenshot to Module 3.2 document
</commit_message>
<xml_diff>
--- a/module-3/Shrestha_Module3.2_Screenshots.docx
+++ b/module-3/Shrestha_Module3.2_Screenshots.docx
@@ -226,6 +226,7 @@
       <w:r>
         <w:rPr>
           <w:rFonts w:asciiTheme="majorHAnsi" w:hAnsiTheme="majorHAnsi" w:cstheme="majorHAnsi"/>
+          <w:noProof/>
           <w:szCs w:val="24"/>
         </w:rPr>
         <w:drawing>
@@ -286,6 +287,9 @@
     </w:p>
     <w:p>
       <w:r>
+        <w:rPr>
+          <w:noProof/>
+        </w:rPr>
         <w:drawing>
           <wp:inline distT="0" distB="0" distL="0" distR="0" wp14:anchorId="6BE15DB0" wp14:editId="7B3831ED">
             <wp:extent cx="5486400" cy="2398395"/>
@@ -323,6 +327,7 @@
         </w:drawing>
       </w:r>
     </w:p>
+    <w:p/>
     <w:p>
       <w:pPr>
         <w:pStyle w:val="Heading2"/>
@@ -343,6 +348,9 @@
     </w:p>
     <w:p>
       <w:r>
+        <w:rPr>
+          <w:noProof/>
+        </w:rPr>
         <w:drawing>
           <wp:inline distT="0" distB="0" distL="0" distR="0" wp14:anchorId="6C102A3C" wp14:editId="5846BA55">
             <wp:extent cx="5486400" cy="4502785"/>
@@ -382,6 +390,9 @@
     </w:p>
     <w:p>
       <w:r>
+        <w:rPr>
+          <w:noProof/>
+        </w:rPr>
         <w:drawing>
           <wp:inline distT="0" distB="0" distL="0" distR="0" wp14:anchorId="49913A8D" wp14:editId="294870EE">
             <wp:extent cx="6427227" cy="918845"/>
@@ -419,6 +430,7 @@
         </w:drawing>
       </w:r>
     </w:p>
+    <w:p/>
     <w:p>
       <w:pPr>
         <w:pStyle w:val="Heading2"/>
@@ -439,6 +451,9 @@
     </w:p>
     <w:p>
       <w:r>
+        <w:rPr>
+          <w:noProof/>
+        </w:rPr>
         <w:drawing>
           <wp:inline distT="0" distB="0" distL="0" distR="0" wp14:anchorId="54B401B5" wp14:editId="08015845">
             <wp:extent cx="6436210" cy="1962150"/>
@@ -476,6 +491,7 @@
         </w:drawing>
       </w:r>
     </w:p>
+    <w:p/>
     <w:p>
       <w:pPr>
         <w:pStyle w:val="Heading2"/>
@@ -502,6 +518,47 @@
           <w:szCs w:val="24"/>
         </w:rPr>
       </w:pPr>
+      <w:r>
+        <w:rPr>
+          <w:rFonts w:asciiTheme="majorHAnsi" w:hAnsiTheme="majorHAnsi" w:cstheme="majorHAnsi"/>
+          <w:szCs w:val="24"/>
+        </w:rPr>
+        <w:drawing>
+          <wp:inline distT="0" distB="0" distL="0" distR="0" wp14:anchorId="77308F62" wp14:editId="62D67310">
+            <wp:extent cx="6419722" cy="3662362"/>
+            <wp:effectExtent l="0" t="0" r="635" b="0"/>
+            <wp:docPr id="802276373" name="Picture 1"/>
+            <wp:cNvGraphicFramePr>
+              <a:graphicFrameLocks xmlns:a="http://schemas.openxmlformats.org/drawingml/2006/main" noChangeAspect="1"/>
+            </wp:cNvGraphicFramePr>
+            <a:graphic xmlns:a="http://schemas.openxmlformats.org/drawingml/2006/main">
+              <a:graphicData uri="http://schemas.openxmlformats.org/drawingml/2006/picture">
+                <pic:pic xmlns:pic="http://schemas.openxmlformats.org/drawingml/2006/picture">
+                  <pic:nvPicPr>
+                    <pic:cNvPr id="802276373" name=""/>
+                    <pic:cNvPicPr/>
+                  </pic:nvPicPr>
+                  <pic:blipFill>
+                    <a:blip r:embed="rId11"/>
+                    <a:stretch>
+                      <a:fillRect/>
+                    </a:stretch>
+                  </pic:blipFill>
+                  <pic:spPr>
+                    <a:xfrm>
+                      <a:off x="0" y="0"/>
+                      <a:ext cx="6429266" cy="3667806"/>
+                    </a:xfrm>
+                    <a:prstGeom prst="rect">
+                      <a:avLst/>
+                    </a:prstGeom>
+                  </pic:spPr>
+                </pic:pic>
+              </a:graphicData>
+            </a:graphic>
+          </wp:inline>
+        </w:drawing>
+      </w:r>
     </w:p>
     <w:p>
       <w:pPr>

</xml_diff>